<commit_message>
docs: DEC-027 limites do horizonte de geracao de ocorrencias (matriz 2.1.5)
Especificacao: DEC-027 na tabela de decisoes, RN-018 remete a ela e nota
de revisao no Anexo C. Matriz 2.1.5 com o novo hash da Especificacao,
RN-018 e DEC-027; schema aceita 27 decisoes. Changelog, PROJECT_CONTEXT
(inclui o papel de DPO) e estado do TS-024 atualizados.

Co-Authored-By: Claude Opus 5.5 <noreply@anthropic.com>
</commit_message>
<xml_diff>
--- a/MeuRemedio_Especificacao_Funcional_02.33.docx
+++ b/MeuRemedio_Especificacao_Funcional_02.33.docx
@@ -3818,6 +3818,116 @@
           </w:p>
         </w:tc>
       </w:tr>
+      <w:tr>
+        <w:trPr>
+          <w:cantSplit/>
+          <w:jc w:val="center"/>
+        </w:trPr>
+        <w:tc>
+          <w:tcPr>
+            <w:tcW w:w="2556" w:type="dxa"/>
+            <w:shd w:val="clear" w:color="auto" w:fill="F3F7F9"/>
+            <w:tcMar>
+              <w:top w:w="80" w:type="dxa"/>
+              <w:left w:w="100" w:type="dxa"/>
+              <w:bottom w:w="80" w:type="dxa"/>
+              <w:right w:w="100" w:type="dxa"/>
+            </w:tcMar>
+            <w:vAlign w:val="center"/>
+          </w:tcPr>
+          <w:p>
+            <w:pPr>
+              <w:spacing w:after="20"/>
+            </w:pPr>
+            <w:r>
+              <w:rPr>
+                <w:sz w:val="16"/>
+              </w:rPr>
+              <w:t xml:space="preserve">DEC-027</w:t>
+            </w:r>
+          </w:p>
+        </w:tc>
+        <w:tc>
+          <w:tcPr>
+            <w:tcW w:w="2556" w:type="dxa"/>
+            <w:shd w:val="clear" w:color="auto" w:fill="F3F7F9"/>
+            <w:tcMar>
+              <w:top w:w="80" w:type="dxa"/>
+              <w:left w:w="100" w:type="dxa"/>
+              <w:bottom w:w="80" w:type="dxa"/>
+              <w:right w:w="100" w:type="dxa"/>
+            </w:tcMar>
+            <w:vAlign w:val="center"/>
+          </w:tcPr>
+          <w:p>
+            <w:pPr>
+              <w:spacing w:after="20"/>
+            </w:pPr>
+            <w:r>
+              <w:rPr>
+                <w:sz w:val="16"/>
+              </w:rPr>
+              <w:t xml:space="preserve">Média</w:t>
+            </w:r>
+          </w:p>
+        </w:tc>
+        <w:tc>
+          <w:tcPr>
+            <w:tcW w:w="2556" w:type="dxa"/>
+            <w:shd w:val="clear" w:color="auto" w:fill="F3F7F9"/>
+            <w:tcMar>
+              <w:top w:w="80" w:type="dxa"/>
+              <w:left w:w="100" w:type="dxa"/>
+              <w:bottom w:w="80" w:type="dxa"/>
+              <w:right w:w="100" w:type="dxa"/>
+            </w:tcMar>
+            <w:vAlign w:val="center"/>
+          </w:tcPr>
+          <w:p>
+            <w:pPr>
+              <w:spacing w:after="20"/>
+              <w:rPr>
+                <w:lang w:val="pt-BR"/>
+              </w:rPr>
+            </w:pPr>
+            <w:r>
+              <w:rPr>
+                <w:sz w:val="16"/>
+                <w:lang w:val="pt-BR"/>
+              </w:rPr>
+              <w:t xml:space="preserve">RF-004 e RN-018 citavam o horizonte móvel de 30 dias sem definir início e fim, nem o tratamento, na criação do plano, de horários do dia que já passaram.</w:t>
+            </w:r>
+          </w:p>
+        </w:tc>
+        <w:tc>
+          <w:tcPr>
+            <w:tcW w:w="2556" w:type="dxa"/>
+            <w:shd w:val="clear" w:color="auto" w:fill="F3F7F9"/>
+            <w:tcMar>
+              <w:top w:w="80" w:type="dxa"/>
+              <w:left w:w="100" w:type="dxa"/>
+              <w:bottom w:w="80" w:type="dxa"/>
+              <w:right w:w="100" w:type="dxa"/>
+            </w:tcMar>
+            <w:vAlign w:val="center"/>
+          </w:tcPr>
+          <w:p>
+            <w:pPr>
+              <w:spacing w:after="20"/>
+              <w:rPr>
+                <w:lang w:val="pt-BR"/>
+              </w:rPr>
+            </w:pPr>
+            <w:r>
+              <w:rPr>
+                <w:sz w:val="16"/>
+                <w:lang w:val="pt-BR"/>
+              </w:rPr>
+              <w:t xml:space="preserve">Horizonte de geração: da data civil atual no fuso da conta (ou de start_date, se posterior) até a data atual + 30 dias, inclusive, limitado a end_date. Horários do dia já passados também são gerados: se deadline_at já foi atingido, a ocorrência nasce NO_RESPONSE, com no_response_reached_at igual ao instante da geração; antes do prazo, nasce PROGRAMMED.</w:t>
+            </w:r>
+          </w:p>
+        </w:tc>
+      </w:tr>
     </w:tbl>
     <w:p>
       <w:pPr>
@@ -5392,7 +5502,7 @@
                 <w:sz w:val="16"/>
                 <w:lang w:val="pt-BR"/>
               </w:rPr>
-              <w:t>Ocorrências são geradas ao criar ou editar o plano (via Outbox) e por job horário que mantém o horizonte de 30 dias; o job de prazo executa a cada minuto. Há no máximo 1 e-mail de lembrete por ocorrência, enviado em scheduled_at, sem nome do medicamento, dose ou link com token. O lembrete web consulta listOccurrences a cada 60 s.</w:t>
+              <w:t>Ocorrências são geradas ao criar ou editar o plano (via Outbox) e por job horário que mantém o horizonte de 30 dias; o job de prazo executa a cada minuto. Há no máximo 1 e-mail de lembrete por ocorrência, enviado em scheduled_at, sem nome do medicamento, dose ou link com token. O lembrete web consulta listOccurrences a cada 60 s. Limites do horizonte e horários já vencidos na geração: DEC-027.</w:t>
             </w:r>
           </w:p>
         </w:tc>
@@ -34585,6 +34695,19 @@
           <w:lang w:val="pt-BR"/>
         </w:rPr>
         <w:t xml:space="preserve">Revisão da OpenAPI para 02.33.4 em 06/10/2026 (DEC-026, GAP-010), proposta para aprovação do mantenedor: ERR-016 INTERNAL_ERROR (500) e 503 DEPENDENCY_UNAVAILABLE documentados em todas as operações, para que falhas inesperadas permaneçam dentro do contrato.</w:t>
+      </w:r>
+    </w:p>
+    <w:p>
+      <w:pPr>
+        <w:rPr>
+          <w:lang w:val="pt-BR"/>
+        </w:rPr>
+      </w:pPr>
+      <w:r>
+        <w:rPr>
+          <w:lang w:val="pt-BR"/>
+        </w:rPr>
+        <w:t xml:space="preserve">Decisão do mantenedor em 06/10/2026 (DEC-027), proposta para aprovação no PR: limites do horizonte móvel de 30 dias (data civil atual até + 30 dias, inclusive) e geração, já vencida, de horários do dia que já passaram.</w:t>
       </w:r>
     </w:p>
     <w:p>

</xml_diff>

<commit_message>
docs: DEC-028 saude tecnica e DEC-029 lista de senhas comprometidas (matriz 2.1.6)
Especificacao: DEC-028 e DEC-029 na tabela de decisoes, RN-017 e RNF-015
remetem a elas e nota de revisao no Anexo C. Matriz 2.1.6 com o novo hash
da Especificacao; schema aceita 29 decisoes. Changelog e PROJECT_CONTEXT
atualizados.

Co-Authored-By: Claude Opus 5.5 <noreply@anthropic.com>
</commit_message>
<xml_diff>
--- a/MeuRemedio_Especificacao_Funcional_02.33.docx
+++ b/MeuRemedio_Especificacao_Funcional_02.33.docx
@@ -3928,6 +3928,226 @@
           </w:p>
         </w:tc>
       </w:tr>
+      <w:tr>
+        <w:trPr>
+          <w:cantSplit/>
+          <w:jc w:val="center"/>
+        </w:trPr>
+        <w:tc>
+          <w:tcPr>
+            <w:tcW w:w="2556" w:type="dxa"/>
+            <w:shd w:val="clear" w:color="auto" w:fill="F3F7F9"/>
+            <w:tcMar>
+              <w:top w:w="80" w:type="dxa"/>
+              <w:left w:w="100" w:type="dxa"/>
+              <w:bottom w:w="80" w:type="dxa"/>
+              <w:right w:w="100" w:type="dxa"/>
+            </w:tcMar>
+            <w:vAlign w:val="center"/>
+          </w:tcPr>
+          <w:p>
+            <w:pPr>
+              <w:spacing w:after="20"/>
+            </w:pPr>
+            <w:r>
+              <w:rPr>
+                <w:sz w:val="16"/>
+              </w:rPr>
+              <w:t xml:space="preserve">DEC-028</w:t>
+            </w:r>
+          </w:p>
+        </w:tc>
+        <w:tc>
+          <w:tcPr>
+            <w:tcW w:w="2556" w:type="dxa"/>
+            <w:shd w:val="clear" w:color="auto" w:fill="F3F7F9"/>
+            <w:tcMar>
+              <w:top w:w="80" w:type="dxa"/>
+              <w:left w:w="100" w:type="dxa"/>
+              <w:bottom w:w="80" w:type="dxa"/>
+              <w:right w:w="100" w:type="dxa"/>
+            </w:tcMar>
+            <w:vAlign w:val="center"/>
+          </w:tcPr>
+          <w:p>
+            <w:pPr>
+              <w:spacing w:after="20"/>
+            </w:pPr>
+            <w:r>
+              <w:rPr>
+                <w:sz w:val="16"/>
+              </w:rPr>
+              <w:t xml:space="preserve">Média</w:t>
+            </w:r>
+          </w:p>
+        </w:tc>
+        <w:tc>
+          <w:tcPr>
+            <w:tcW w:w="2556" w:type="dxa"/>
+            <w:shd w:val="clear" w:color="auto" w:fill="F3F7F9"/>
+            <w:tcMar>
+              <w:top w:w="80" w:type="dxa"/>
+              <w:left w:w="100" w:type="dxa"/>
+              <w:bottom w:w="80" w:type="dxa"/>
+              <w:right w:w="100" w:type="dxa"/>
+            </w:tcMar>
+            <w:vAlign w:val="center"/>
+          </w:tcPr>
+          <w:p>
+            <w:pPr>
+              <w:spacing w:after="20"/>
+              <w:rPr>
+                <w:lang w:val="pt-BR"/>
+              </w:rPr>
+            </w:pPr>
+            <w:r>
+              <w:rPr>
+                <w:sz w:val="16"/>
+                <w:lang w:val="pt-BR"/>
+              </w:rPr>
+              <w:t xml:space="preserve">RNF-015 e DEC-020 não definiam a referência para medir o desvio de relógio, o status HTTP de getHealth em DEGRADED nem o critério de DOWN.</w:t>
+            </w:r>
+          </w:p>
+        </w:tc>
+        <w:tc>
+          <w:tcPr>
+            <w:tcW w:w="2556" w:type="dxa"/>
+            <w:shd w:val="clear" w:color="auto" w:fill="F3F7F9"/>
+            <w:tcMar>
+              <w:top w:w="80" w:type="dxa"/>
+              <w:left w:w="100" w:type="dxa"/>
+              <w:bottom w:w="80" w:type="dxa"/>
+              <w:right w:w="100" w:type="dxa"/>
+            </w:tcMar>
+            <w:vAlign w:val="center"/>
+          </w:tcPr>
+          <w:p>
+            <w:pPr>
+              <w:spacing w:after="20"/>
+              <w:rPr>
+                <w:lang w:val="pt-BR"/>
+              </w:rPr>
+            </w:pPr>
+            <w:r>
+              <w:rPr>
+                <w:sz w:val="16"/>
+                <w:lang w:val="pt-BR"/>
+              </w:rPr>
+              <w:t xml:space="preserve">getHealth compara, a cada chamada, o Clock da API com o now() do PostgreSQL: desvio absoluto acima de CLOCK_SKEW_MAX_MS retorna DEGRADED com 503. PostgreSQL sem resposta dentro do tempo-limite da sondagem (padrão 2 s, configurável) retorna DOWN com 503. Caso contrário, UP com 200. O corpo é Health em todos os casos; e-mail, storage e fila não entram na sondagem.</w:t>
+            </w:r>
+          </w:p>
+        </w:tc>
+      </w:tr>
+      <w:tr>
+        <w:trPr>
+          <w:cantSplit/>
+          <w:jc w:val="center"/>
+        </w:trPr>
+        <w:tc>
+          <w:tcPr>
+            <w:tcW w:w="2556" w:type="dxa"/>
+            <w:shd w:val="clear" w:color="auto" w:fill="F3F7F9"/>
+            <w:tcMar>
+              <w:top w:w="80" w:type="dxa"/>
+              <w:left w:w="100" w:type="dxa"/>
+              <w:bottom w:w="80" w:type="dxa"/>
+              <w:right w:w="100" w:type="dxa"/>
+            </w:tcMar>
+            <w:vAlign w:val="center"/>
+          </w:tcPr>
+          <w:p>
+            <w:pPr>
+              <w:spacing w:after="20"/>
+            </w:pPr>
+            <w:r>
+              <w:rPr>
+                <w:sz w:val="16"/>
+              </w:rPr>
+              <w:t xml:space="preserve">DEC-029</w:t>
+            </w:r>
+          </w:p>
+        </w:tc>
+        <w:tc>
+          <w:tcPr>
+            <w:tcW w:w="2556" w:type="dxa"/>
+            <w:shd w:val="clear" w:color="auto" w:fill="F3F7F9"/>
+            <w:tcMar>
+              <w:top w:w="80" w:type="dxa"/>
+              <w:left w:w="100" w:type="dxa"/>
+              <w:bottom w:w="80" w:type="dxa"/>
+              <w:right w:w="100" w:type="dxa"/>
+            </w:tcMar>
+            <w:vAlign w:val="center"/>
+          </w:tcPr>
+          <w:p>
+            <w:pPr>
+              <w:spacing w:after="20"/>
+            </w:pPr>
+            <w:r>
+              <w:rPr>
+                <w:sz w:val="16"/>
+              </w:rPr>
+              <w:t xml:space="preserve">Média</w:t>
+            </w:r>
+          </w:p>
+        </w:tc>
+        <w:tc>
+          <w:tcPr>
+            <w:tcW w:w="2556" w:type="dxa"/>
+            <w:shd w:val="clear" w:color="auto" w:fill="F3F7F9"/>
+            <w:tcMar>
+              <w:top w:w="80" w:type="dxa"/>
+              <w:left w:w="100" w:type="dxa"/>
+              <w:bottom w:w="80" w:type="dxa"/>
+              <w:right w:w="100" w:type="dxa"/>
+            </w:tcMar>
+            <w:vAlign w:val="center"/>
+          </w:tcPr>
+          <w:p>
+            <w:pPr>
+              <w:spacing w:after="20"/>
+              <w:rPr>
+                <w:lang w:val="pt-BR"/>
+              </w:rPr>
+            </w:pPr>
+            <w:r>
+              <w:rPr>
+                <w:sz w:val="16"/>
+                <w:lang w:val="pt-BR"/>
+              </w:rPr>
+              <w:t xml:space="preserve">RN-017 e DEC-015 exigiam lista local versionada de senhas comprometidas sem definir a fonte.</w:t>
+            </w:r>
+          </w:p>
+        </w:tc>
+        <w:tc>
+          <w:tcPr>
+            <w:tcW w:w="2556" w:type="dxa"/>
+            <w:shd w:val="clear" w:color="auto" w:fill="F3F7F9"/>
+            <w:tcMar>
+              <w:top w:w="80" w:type="dxa"/>
+              <w:left w:w="100" w:type="dxa"/>
+              <w:bottom w:w="80" w:type="dxa"/>
+              <w:right w:w="100" w:type="dxa"/>
+            </w:tcMar>
+            <w:vAlign w:val="center"/>
+          </w:tcPr>
+          <w:p>
+            <w:pPr>
+              <w:spacing w:after="20"/>
+              <w:rPr>
+                <w:lang w:val="pt-BR"/>
+              </w:rPr>
+            </w:pPr>
+            <w:r>
+              <w:rPr>
+                <w:sz w:val="16"/>
+                <w:lang w:val="pt-BR"/>
+              </w:rPr>
+              <w:t xml:space="preserve">Fonte: SecLists, arquivo Passwords/Common-Credentials/10-million-password-list-top-100000.txt (licença MIT), versionado no repositório com origem e SHA-256 registrados. A senha informada é rejeitada quando coincide exatamente com uma entrada da lista; a atualização da lista entra por PR próprio.</w:t>
+            </w:r>
+          </w:p>
+        </w:tc>
+      </w:tr>
     </w:tbl>
     <w:p>
       <w:pPr>
@@ -5423,7 +5643,7 @@
                 <w:sz w:val="16"/>
                 <w:lang w:val="pt-BR"/>
               </w:rPr>
-              <w:t>Senha de 10 a 72 caracteres com minúscula, maiúscula e dígito, fora da lista local de senhas comprometidas e sem consulta remota; hash Argon2id. Token de verificação vale 24 h e o de redefinição 60 min, ambos de uso único; novo token invalida o anterior.</w:t>
+              <w:t>Senha de 10 a 72 caracteres com minúscula, maiúscula e dígito, fora da lista local de senhas comprometidas e sem consulta remota; hash Argon2id. Token de verificação vale 24 h e o de redefinição 60 min, ambos de uso único; novo token invalida o anterior. Fonte da lista de senhas comprometidas: DEC-029.</w:t>
             </w:r>
           </w:p>
         </w:tc>
@@ -12319,7 +12539,7 @@
                 <w:sz w:val="16"/>
                 <w:lang w:val="pt-BR"/>
               </w:rPr>
-              <w:t>Relógios sincronizados; desvio acima de CLOCK_SKEW_MAX_MS (padrão 5 s) bloqueia decisões temporais críticas e marca getHealth como DEGRADED.</w:t>
+              <w:t>Relógios sincronizados; desvio acima de CLOCK_SKEW_MAX_MS (padrão 5 s) bloqueia decisões temporais críticas e marca getHealth como DEGRADED. Referência do desvio e estados de getHealth: DEC-028.</w:t>
             </w:r>
           </w:p>
         </w:tc>
@@ -34708,6 +34928,19 @@
           <w:lang w:val="pt-BR"/>
         </w:rPr>
         <w:t xml:space="preserve">Decisão do mantenedor em 06/10/2026 (DEC-027), proposta para aprovação no PR: limites do horizonte móvel de 30 dias (data civil atual até + 30 dias, inclusive) e geração, já vencida, de horários do dia que já passaram.</w:t>
+      </w:r>
+    </w:p>
+    <w:p>
+      <w:pPr>
+        <w:rPr>
+          <w:lang w:val="pt-BR"/>
+        </w:rPr>
+      </w:pPr>
+      <w:r>
+        <w:rPr>
+          <w:lang w:val="pt-BR"/>
+        </w:rPr>
+        <w:t xml:space="preserve">Decisões do mantenedor em 08/10/2026 (DEC-028 e DEC-029), propostas para aprovação no PR: referência e estados de getHealth (desvio contra o relógio do PostgreSQL, DEGRADED e DOWN com 503) e fonte da lista de senhas comprometidas (SecLists top 100.000).</w:t>
       </w:r>
     </w:p>
     <w:p>

</xml_diff>

<commit_message>
docs: DEC-030 createAccount com e-mail ja cadastrado retorna 409 STATE_CONFLICT
Co-Authored-By: Claude Opus 5.5 <noreply@anthropic.com>
</commit_message>
<xml_diff>
--- a/MeuRemedio_Especificacao_Funcional_02.33.docx
+++ b/MeuRemedio_Especificacao_Funcional_02.33.docx
@@ -4144,6 +4144,116 @@
                 <w:lang w:val="pt-BR"/>
               </w:rPr>
               <w:t xml:space="preserve">Fonte: SecLists, arquivo Passwords/Common-Credentials/10-million-password-list-top-100000.txt (licença MIT), versionado no repositório com origem e SHA-256 registrados. A senha informada é rejeitada quando coincide exatamente com uma entrada da lista; a atualização da lista entra por PR próprio.</w:t>
+            </w:r>
+          </w:p>
+        </w:tc>
+      </w:tr>
+      <w:tr>
+        <w:trPr>
+          <w:cantSplit/>
+          <w:jc w:val="center"/>
+        </w:trPr>
+        <w:tc>
+          <w:tcPr>
+            <w:tcW w:w="2556" w:type="dxa"/>
+            <w:shd w:val="clear" w:color="auto" w:fill="F3F7F9"/>
+            <w:tcMar>
+              <w:top w:w="80" w:type="dxa"/>
+              <w:left w:w="100" w:type="dxa"/>
+              <w:bottom w:w="80" w:type="dxa"/>
+              <w:right w:w="100" w:type="dxa"/>
+            </w:tcMar>
+            <w:vAlign w:val="center"/>
+          </w:tcPr>
+          <w:p>
+            <w:pPr>
+              <w:spacing w:after="20"/>
+            </w:pPr>
+            <w:r>
+              <w:rPr>
+                <w:sz w:val="16"/>
+              </w:rPr>
+              <w:t xml:space="preserve">DEC-030</w:t>
+            </w:r>
+          </w:p>
+        </w:tc>
+        <w:tc>
+          <w:tcPr>
+            <w:tcW w:w="2556" w:type="dxa"/>
+            <w:shd w:val="clear" w:color="auto" w:fill="F3F7F9"/>
+            <w:tcMar>
+              <w:top w:w="80" w:type="dxa"/>
+              <w:left w:w="100" w:type="dxa"/>
+              <w:bottom w:w="80" w:type="dxa"/>
+              <w:right w:w="100" w:type="dxa"/>
+            </w:tcMar>
+            <w:vAlign w:val="center"/>
+          </w:tcPr>
+          <w:p>
+            <w:pPr>
+              <w:spacing w:after="20"/>
+            </w:pPr>
+            <w:r>
+              <w:rPr>
+                <w:sz w:val="16"/>
+              </w:rPr>
+              <w:t xml:space="preserve">Média</w:t>
+            </w:r>
+          </w:p>
+        </w:tc>
+        <w:tc>
+          <w:tcPr>
+            <w:tcW w:w="2556" w:type="dxa"/>
+            <w:shd w:val="clear" w:color="auto" w:fill="F3F7F9"/>
+            <w:tcMar>
+              <w:top w:w="80" w:type="dxa"/>
+              <w:left w:w="100" w:type="dxa"/>
+              <w:bottom w:w="80" w:type="dxa"/>
+              <w:right w:w="100" w:type="dxa"/>
+            </w:tcMar>
+            <w:vAlign w:val="center"/>
+          </w:tcPr>
+          <w:p>
+            <w:pPr>
+              <w:spacing w:after="20"/>
+              <w:rPr>
+                <w:lang w:val="pt-BR"/>
+              </w:rPr>
+            </w:pPr>
+            <w:r>
+              <w:rPr>
+                <w:sz w:val="16"/>
+                <w:lang w:val="pt-BR"/>
+              </w:rPr>
+              <w:t xml:space="preserve">A Especificação não definia o resultado de createAccount para e-mail que já possui conta (users.email_normalized é único).</w:t>
+            </w:r>
+          </w:p>
+        </w:tc>
+        <w:tc>
+          <w:tcPr>
+            <w:tcW w:w="2556" w:type="dxa"/>
+            <w:shd w:val="clear" w:color="auto" w:fill="F3F7F9"/>
+            <w:tcMar>
+              <w:top w:w="80" w:type="dxa"/>
+              <w:left w:w="100" w:type="dxa"/>
+              <w:bottom w:w="80" w:type="dxa"/>
+              <w:right w:w="100" w:type="dxa"/>
+            </w:tcMar>
+            <w:vAlign w:val="center"/>
+          </w:tcPr>
+          <w:p>
+            <w:pPr>
+              <w:spacing w:after="20"/>
+              <w:rPr>
+                <w:lang w:val="pt-BR"/>
+              </w:rPr>
+            </w:pPr>
+            <w:r>
+              <w:rPr>
+                <w:sz w:val="16"/>
+                <w:lang w:val="pt-BR"/>
+              </w:rPr>
+              <w:t xml:space="preserve">createAccount com e-mail normalizado já cadastrado, em qualquer estado da conta, retorna 409 STATE_CONFLICT sem criar conta, token ou e-mail. A exposição de que o e-mail tem conta é aceita e mitigada pelo rate limit de rotas públicas (RNF-006).</w:t>
             </w:r>
           </w:p>
         </w:tc>
@@ -34941,6 +35051,19 @@
           <w:lang w:val="pt-BR"/>
         </w:rPr>
         <w:t xml:space="preserve">Decisões do mantenedor em 08/10/2026 (DEC-028 e DEC-029), propostas para aprovação no PR: referência e estados de getHealth (desvio contra o relógio do PostgreSQL, DEGRADED e DOWN com 503) e fonte da lista de senhas comprometidas (SecLists top 100.000).</w:t>
+      </w:r>
+    </w:p>
+    <w:p>
+      <w:pPr>
+        <w:rPr>
+          <w:lang w:val="pt-BR"/>
+        </w:rPr>
+      </w:pPr>
+      <w:r>
+        <w:rPr>
+          <w:lang w:val="pt-BR"/>
+        </w:rPr>
+        <w:t xml:space="preserve">Decisão do mantenedor em 08/10/2026 (DEC-030), proposta para aprovação no PR: createAccount com e-mail já cadastrado retorna 409 STATE_CONFLICT.</w:t>
       </w:r>
     </w:p>
     <w:p>

</xml_diff>

<commit_message>
docs: DEC-031 nome do medicamento e horario no e-mail de lembrete
Co-Authored-By: Claude Opus 5.5 <noreply@anthropic.com>
Claude-Session: https://claude.ai/code/session_01BJTnd9MNpe8S7RcxNmqx1M
</commit_message>
<xml_diff>
--- a/MeuRemedio_Especificacao_Funcional_02.33.docx
+++ b/MeuRemedio_Especificacao_Funcional_02.33.docx
@@ -4258,6 +4258,116 @@
           </w:p>
         </w:tc>
       </w:tr>
+      <w:tr>
+        <w:trPr>
+          <w:cantSplit/>
+          <w:jc w:val="center"/>
+        </w:trPr>
+        <w:tc>
+          <w:tcPr>
+            <w:tcW w:w="2556" w:type="dxa"/>
+            <w:shd w:val="clear" w:color="auto" w:fill="F3F7F9"/>
+            <w:tcMar>
+              <w:top w:w="80" w:type="dxa"/>
+              <w:left w:w="100" w:type="dxa"/>
+              <w:bottom w:w="80" w:type="dxa"/>
+              <w:right w:w="100" w:type="dxa"/>
+            </w:tcMar>
+            <w:vAlign w:val="center"/>
+          </w:tcPr>
+          <w:p>
+            <w:pPr>
+              <w:spacing w:after="20"/>
+            </w:pPr>
+            <w:r>
+              <w:rPr>
+                <w:sz w:val="16"/>
+              </w:rPr>
+              <w:t xml:space="preserve">DEC-031</w:t>
+            </w:r>
+          </w:p>
+        </w:tc>
+        <w:tc>
+          <w:tcPr>
+            <w:tcW w:w="2556" w:type="dxa"/>
+            <w:shd w:val="clear" w:color="auto" w:fill="F3F7F9"/>
+            <w:tcMar>
+              <w:top w:w="80" w:type="dxa"/>
+              <w:left w:w="100" w:type="dxa"/>
+              <w:bottom w:w="80" w:type="dxa"/>
+              <w:right w:w="100" w:type="dxa"/>
+            </w:tcMar>
+            <w:vAlign w:val="center"/>
+          </w:tcPr>
+          <w:p>
+            <w:pPr>
+              <w:spacing w:after="20"/>
+            </w:pPr>
+            <w:r>
+              <w:rPr>
+                <w:sz w:val="16"/>
+              </w:rPr>
+              <w:t xml:space="preserve">Alta</w:t>
+            </w:r>
+          </w:p>
+        </w:tc>
+        <w:tc>
+          <w:tcPr>
+            <w:tcW w:w="2556" w:type="dxa"/>
+            <w:shd w:val="clear" w:color="auto" w:fill="F3F7F9"/>
+            <w:tcMar>
+              <w:top w:w="80" w:type="dxa"/>
+              <w:left w:w="100" w:type="dxa"/>
+              <w:bottom w:w="80" w:type="dxa"/>
+              <w:right w:w="100" w:type="dxa"/>
+            </w:tcMar>
+            <w:vAlign w:val="center"/>
+          </w:tcPr>
+          <w:p>
+            <w:pPr>
+              <w:spacing w:after="20"/>
+              <w:rPr>
+                <w:lang w:val="pt-BR"/>
+              </w:rPr>
+            </w:pPr>
+            <w:r>
+              <w:rPr>
+                <w:sz w:val="16"/>
+                <w:lang w:val="pt-BR"/>
+              </w:rPr>
+              <w:t xml:space="preserve">RN-018 excluía do e-mail de lembrete o nome do medicamento e o horário, o que obrigava o titular a abrir a aplicação para saber qual medicamento tomar.</w:t>
+            </w:r>
+          </w:p>
+        </w:tc>
+        <w:tc>
+          <w:tcPr>
+            <w:tcW w:w="2556" w:type="dxa"/>
+            <w:shd w:val="clear" w:color="auto" w:fill="F3F7F9"/>
+            <w:tcMar>
+              <w:top w:w="80" w:type="dxa"/>
+              <w:left w:w="100" w:type="dxa"/>
+              <w:bottom w:w="80" w:type="dxa"/>
+              <w:right w:w="100" w:type="dxa"/>
+            </w:tcMar>
+            <w:vAlign w:val="center"/>
+          </w:tcPr>
+          <w:p>
+            <w:pPr>
+              <w:spacing w:after="20"/>
+              <w:rPr>
+                <w:lang w:val="pt-BR"/>
+              </w:rPr>
+            </w:pPr>
+            <w:r>
+              <w:rPr>
+                <w:sz w:val="16"/>
+                <w:lang w:val="pt-BR"/>
+              </w:rPr>
+              <w:t xml:space="preserve">O e-mail de lembrete informa o nome do medicamento (snapshot da ocorrência) e o horário local previsto (HH:MM no fuso da conta). Continuam proibidos a dose e o link com token. Risco aceito pelo mantenedor: o nome do medicamento é dado de saúde e fica exposto ao provedor de e-mail e a quem acessar a caixa postal ou as notificações do aparelho; a decisão fica sujeita ao parecer de privacidade (GX-001 a GX-006).</w:t>
+            </w:r>
+          </w:p>
+        </w:tc>
+      </w:tr>
     </w:tbl>
     <w:p>
       <w:pPr>
@@ -5832,7 +5942,7 @@
                 <w:sz w:val="16"/>
                 <w:lang w:val="pt-BR"/>
               </w:rPr>
-              <w:t>Ocorrências são geradas ao criar ou editar o plano (via Outbox) e por job horário que mantém o horizonte de 30 dias; o job de prazo executa a cada minuto. Há no máximo 1 e-mail de lembrete por ocorrência, enviado em scheduled_at, sem nome do medicamento, dose ou link com token. O lembrete web consulta listOccurrences a cada 60 s. Limites do horizonte e horários já vencidos na geração: DEC-027.</w:t>
+              <w:t>Ocorrências são geradas ao criar ou editar o plano (via Outbox) e por job horário que mantém o horizonte de 30 dias; o job de prazo executa a cada minuto. Há no máximo 1 e-mail de lembrete por ocorrência, enviado em scheduled_at, com o nome do medicamento e o horário local previsto, sem dose nem link com token (DEC-031). O lembrete web consulta listOccurrences a cada 60 s. Limites do horizonte e horários já vencidos na geração: DEC-027.</w:t>
             </w:r>
           </w:p>
         </w:tc>
@@ -35064,6 +35174,19 @@
           <w:lang w:val="pt-BR"/>
         </w:rPr>
         <w:t xml:space="preserve">Decisão do mantenedor em 08/10/2026 (DEC-030), proposta para aprovação no PR: createAccount com e-mail já cadastrado retorna 409 STATE_CONFLICT.</w:t>
+      </w:r>
+    </w:p>
+    <w:p>
+      <w:pPr>
+        <w:rPr>
+          <w:lang w:val="pt-BR"/>
+        </w:rPr>
+      </w:pPr>
+      <w:r>
+        <w:rPr>
+          <w:lang w:val="pt-BR"/>
+        </w:rPr>
+        <w:t xml:space="preserve">Decisão do mantenedor em 10/10/2026 (DEC-031), proposta para aprovação no PR: o e-mail de lembrete informa o nome do medicamento e o horário local previsto, sem dose nem link com token (altera RN-018 e, nesse ponto, DEC-017).</w:t>
       </w:r>
     </w:p>
     <w:p>

</xml_diff>

<commit_message>
feat: DEC-033 conta pendente com 30 dias e matriz 2.1.9 com os artefatos de teste implementados
Especificacao (DEC-033 na tabela de decisoes e nota no Anexo C); matriz 2.1.9
com hash, DEC-033, catalogo de decisoes e test_artifacts dos 37 TS implementados;
schema aceita 33 decisoes; teste de contrato dos artefatos; changelog e contexto.

Co-Authored-By: Claude Opus 5.5 <noreply@anthropic.com>
</commit_message>
<xml_diff>
--- a/MeuRemedio_Especificacao_Funcional_02.33.docx
+++ b/MeuRemedio_Especificacao_Funcional_02.33.docx
@@ -4474,6 +4474,116 @@
                 <w:lang w:val="pt-BR"/>
               </w:rPr>
               <w:t xml:space="preserve">Declarar 400 VALIDATION_FAILED (ERR-001) nas três operações (OpenAPI 02.33.5) e exigir, no TS-040, 400 em toda operação com corpo ou parâmetro de query ou cabeçalho validado.</w:t>
+            </w:r>
+          </w:p>
+        </w:tc>
+      </w:tr>
+      <w:tr>
+        <w:trPr>
+          <w:cantSplit/>
+          <w:jc w:val="center"/>
+        </w:trPr>
+        <w:tc>
+          <w:tcPr>
+            <w:tcW w:w="2556" w:type="dxa"/>
+            <w:shd w:val="clear" w:color="auto" w:fill="F3F7F9"/>
+            <w:tcMar>
+              <w:top w:w="80" w:type="dxa"/>
+              <w:left w:w="100" w:type="dxa"/>
+              <w:bottom w:w="80" w:type="dxa"/>
+              <w:right w:w="100" w:type="dxa"/>
+            </w:tcMar>
+            <w:vAlign w:val="center"/>
+          </w:tcPr>
+          <w:p>
+            <w:pPr>
+              <w:spacing w:after="20"/>
+            </w:pPr>
+            <w:r>
+              <w:rPr>
+                <w:sz w:val="16"/>
+              </w:rPr>
+              <w:t xml:space="preserve">DEC-033</w:t>
+            </w:r>
+          </w:p>
+        </w:tc>
+        <w:tc>
+          <w:tcPr>
+            <w:tcW w:w="2556" w:type="dxa"/>
+            <w:shd w:val="clear" w:color="auto" w:fill="F3F7F9"/>
+            <w:tcMar>
+              <w:top w:w="80" w:type="dxa"/>
+              <w:left w:w="100" w:type="dxa"/>
+              <w:bottom w:w="80" w:type="dxa"/>
+              <w:right w:w="100" w:type="dxa"/>
+            </w:tcMar>
+            <w:vAlign w:val="center"/>
+          </w:tcPr>
+          <w:p>
+            <w:pPr>
+              <w:spacing w:after="20"/>
+            </w:pPr>
+            <w:r>
+              <w:rPr>
+                <w:sz w:val="16"/>
+              </w:rPr>
+              <w:t xml:space="preserve">Média</w:t>
+            </w:r>
+          </w:p>
+        </w:tc>
+        <w:tc>
+          <w:tcPr>
+            <w:tcW w:w="2556" w:type="dxa"/>
+            <w:shd w:val="clear" w:color="auto" w:fill="F3F7F9"/>
+            <w:tcMar>
+              <w:top w:w="80" w:type="dxa"/>
+              <w:left w:w="100" w:type="dxa"/>
+              <w:bottom w:w="80" w:type="dxa"/>
+              <w:right w:w="100" w:type="dxa"/>
+            </w:tcMar>
+            <w:vAlign w:val="center"/>
+          </w:tcPr>
+          <w:p>
+            <w:pPr>
+              <w:spacing w:after="20"/>
+              <w:rPr>
+                <w:lang w:val="pt-BR"/>
+              </w:rPr>
+            </w:pPr>
+            <w:r>
+              <w:rPr>
+                <w:sz w:val="16"/>
+                <w:lang w:val="pt-BR"/>
+              </w:rPr>
+              <w:t xml:space="preserve">TS-028 exigia remover a conta pendente antiga sem órfãos, mas não definia a partir de quando a conta pendente é antiga.</w:t>
+            </w:r>
+          </w:p>
+        </w:tc>
+        <w:tc>
+          <w:tcPr>
+            <w:tcW w:w="2556" w:type="dxa"/>
+            <w:shd w:val="clear" w:color="auto" w:fill="F3F7F9"/>
+            <w:tcMar>
+              <w:top w:w="80" w:type="dxa"/>
+              <w:left w:w="100" w:type="dxa"/>
+              <w:bottom w:w="80" w:type="dxa"/>
+              <w:right w:w="100" w:type="dxa"/>
+            </w:tcMar>
+            <w:vAlign w:val="center"/>
+          </w:tcPr>
+          <w:p>
+            <w:pPr>
+              <w:spacing w:after="20"/>
+              <w:rPr>
+                <w:lang w:val="pt-BR"/>
+              </w:rPr>
+            </w:pPr>
+            <w:r>
+              <w:rPr>
+                <w:sz w:val="16"/>
+                <w:lang w:val="pt-BR"/>
+              </w:rPr>
+              <w:t xml:space="preserve">A conta que segue PENDING_VERIFICATION 30 dias após o cadastro é removida pelo job de expurgo, com tokens, eventos do Outbox, snapshot de idempotência e contador de login, sem tombstone; o e-mail fica livre para novo cadastro.</w:t>
             </w:r>
           </w:p>
         </w:tc>
@@ -35310,6 +35420,19 @@
           <w:lang w:val="pt-BR"/>
         </w:rPr>
         <w:t xml:space="preserve">Revisão da OpenAPI para 02.33.5 em 10/10/2026 (DEC-032), proposta para aprovação no PR: 400 VALIDATION_FAILED documentado em createSession, revokeAllSessions e requestAccountDeletion.</w:t>
+      </w:r>
+    </w:p>
+    <w:p>
+      <w:pPr>
+        <w:rPr>
+          <w:lang w:val="pt-BR"/>
+        </w:rPr>
+      </w:pPr>
+      <w:r>
+        <w:rPr>
+          <w:lang w:val="pt-BR"/>
+        </w:rPr>
+        <w:t xml:space="preserve">Decisão de 14/10/2026 (DEC-033), proposta para aprovação no PR: a conta que segue PENDING_VERIFICATION 30 dias após o cadastro é removida pelo job de expurgo, sem órfãos e sem tombstone (TS-028).</w:t>
       </w:r>
     </w:p>
     <w:p>

</xml_diff>

<commit_message>
docs: DEC-038 motivo do tratamento (Especificacao com ENT-018, AGENTS 1.11, hashes da matriz)
Co-Authored-By: Claude Opus 5.5 <noreply@anthropic.com>
Claude-Session: https://claude.ai/code/session_017rNdJgpe4PD9X2bVXfNRL5
</commit_message>
<xml_diff>
--- a/MeuRemedio_Especificacao_Funcional_02.33.docx
+++ b/MeuRemedio_Especificacao_Funcional_02.33.docx
@@ -5028,6 +5028,116 @@
           </w:p>
         </w:tc>
       </w:tr>
+      <w:tr>
+        <w:trPr>
+          <w:cantSplit/>
+          <w:jc w:val="center"/>
+        </w:trPr>
+        <w:tc>
+          <w:tcPr>
+            <w:tcW w:w="2556" w:type="dxa"/>
+            <w:shd w:val="clear" w:color="auto" w:fill="F3F7F9"/>
+            <w:tcMar>
+              <w:top w:w="80" w:type="dxa"/>
+              <w:left w:w="100" w:type="dxa"/>
+              <w:bottom w:w="80" w:type="dxa"/>
+              <w:right w:w="100" w:type="dxa"/>
+            </w:tcMar>
+            <w:vAlign w:val="center"/>
+          </w:tcPr>
+          <w:p>
+            <w:pPr>
+              <w:spacing w:after="20"/>
+            </w:pPr>
+            <w:r>
+              <w:rPr>
+                <w:sz w:val="16"/>
+              </w:rPr>
+              <w:t xml:space="preserve">DEC-038</w:t>
+            </w:r>
+          </w:p>
+        </w:tc>
+        <w:tc>
+          <w:tcPr>
+            <w:tcW w:w="2556" w:type="dxa"/>
+            <w:shd w:val="clear" w:color="auto" w:fill="F3F7F9"/>
+            <w:tcMar>
+              <w:top w:w="80" w:type="dxa"/>
+              <w:left w:w="100" w:type="dxa"/>
+              <w:bottom w:w="80" w:type="dxa"/>
+              <w:right w:w="100" w:type="dxa"/>
+            </w:tcMar>
+            <w:vAlign w:val="center"/>
+          </w:tcPr>
+          <w:p>
+            <w:pPr>
+              <w:spacing w:after="20"/>
+            </w:pPr>
+            <w:r>
+              <w:rPr>
+                <w:sz w:val="16"/>
+              </w:rPr>
+              <w:t xml:space="preserve">Média</w:t>
+            </w:r>
+          </w:p>
+        </w:tc>
+        <w:tc>
+          <w:tcPr>
+            <w:tcW w:w="2556" w:type="dxa"/>
+            <w:shd w:val="clear" w:color="auto" w:fill="F3F7F9"/>
+            <w:tcMar>
+              <w:top w:w="80" w:type="dxa"/>
+              <w:left w:w="100" w:type="dxa"/>
+              <w:bottom w:w="80" w:type="dxa"/>
+              <w:right w:w="100" w:type="dxa"/>
+            </w:tcMar>
+            <w:vAlign w:val="center"/>
+          </w:tcPr>
+          <w:p>
+            <w:pPr>
+              <w:spacing w:after="20"/>
+              <w:rPr>
+                <w:lang w:val="pt-BR"/>
+              </w:rPr>
+            </w:pPr>
+            <w:r>
+              <w:rPr>
+                <w:sz w:val="16"/>
+                <w:lang w:val="pt-BR"/>
+              </w:rPr>
+              <w:t xml:space="preserve">O plano não registrava por que o medicamento é tomado: o titular não conseguia ver juntos os remédios de um mesmo motivo, nem levar esse contexto ao histórico e ao PDF.</w:t>
+            </w:r>
+          </w:p>
+        </w:tc>
+        <w:tc>
+          <w:tcPr>
+            <w:tcW w:w="2556" w:type="dxa"/>
+            <w:shd w:val="clear" w:color="auto" w:fill="F3F7F9"/>
+            <w:tcMar>
+              <w:top w:w="80" w:type="dxa"/>
+              <w:left w:w="100" w:type="dxa"/>
+              <w:bottom w:w="80" w:type="dxa"/>
+              <w:right w:w="100" w:type="dxa"/>
+            </w:tcMar>
+            <w:vAlign w:val="center"/>
+          </w:tcPr>
+          <w:p>
+            <w:pPr>
+              <w:spacing w:after="20"/>
+              <w:rPr>
+                <w:lang w:val="pt-BR"/>
+              </w:rPr>
+            </w:pPr>
+            <w:r>
+              <w:rPr>
+                <w:sz w:val="16"/>
+                <w:lang w:val="pt-BR"/>
+              </w:rPr>
+              <w:t xml:space="preserve">Motivo do tratamento (OpenAPI 02.33.10): PlanWrite e CreatePlanRequest ganham treatment_reason, texto opcional de 1 a 80 caracteres, aparado. O motivo é uma entidade do titular (TreatmentReason, ENT-018), identificada pelo nome normalizado como na duplicidade (RN-016): o mesmo nome em outro plano reaproveita o motivo existente, que mantém o nome da primeira gravação. Cada plano tem no máximo um motivo; Plan devolve treatment_reason (treatment_reason_id e name) ou null. A nova operação listTreatmentReasons (GET /treatment-reasons) lista os motivos usados por pelo menos um plano não excluído, em ordem alfabética, com a quantidade de planos e paginação por cursor. Motivo sem plano não excluído é apagado na mesma transação. Occurrence ganha treatment_reason_snapshot, o nome do motivo quando a ocorrência foi gerada, que acompanha o histórico e o PDF da exportação. O motivo é dado de saúde sensível declarado pelo titular, com o mesmo tratamento do nome e da dose do medicamento.</w:t>
+            </w:r>
+          </w:p>
+        </w:tc>
+      </w:tr>
     </w:tbl>
     <w:p>
       <w:pPr>
@@ -8171,6 +8281,85 @@
                 <w:lang w:val="pt-BR"/>
               </w:rPr>
               <w:t xml:space="preserve">Perfil versionado e reproduzível de desempenho.</w:t>
+            </w:r>
+          </w:p>
+        </w:tc>
+      </w:tr>
+      <w:tr>
+        <w:trPr>
+          <w:cantSplit/>
+          <w:jc w:val="center"/>
+        </w:trPr>
+        <w:tc>
+          <w:tcPr>
+            <w:tcW w:w="3408" w:type="dxa"/>
+            <w:tcMar>
+              <w:top w:w="80" w:type="dxa"/>
+              <w:left w:w="100" w:type="dxa"/>
+              <w:bottom w:w="80" w:type="dxa"/>
+              <w:right w:w="100" w:type="dxa"/>
+            </w:tcMar>
+            <w:vAlign w:val="center"/>
+          </w:tcPr>
+          <w:p>
+            <w:pPr>
+              <w:spacing w:after="20"/>
+            </w:pPr>
+            <w:r>
+              <w:rPr>
+                <w:sz w:val="16"/>
+              </w:rPr>
+              <w:t xml:space="preserve">ENT-018</w:t>
+            </w:r>
+          </w:p>
+        </w:tc>
+        <w:tc>
+          <w:tcPr>
+            <w:tcW w:w="3408" w:type="dxa"/>
+            <w:tcMar>
+              <w:top w:w="80" w:type="dxa"/>
+              <w:left w:w="100" w:type="dxa"/>
+              <w:bottom w:w="80" w:type="dxa"/>
+              <w:right w:w="100" w:type="dxa"/>
+            </w:tcMar>
+            <w:vAlign w:val="center"/>
+          </w:tcPr>
+          <w:p>
+            <w:pPr>
+              <w:spacing w:after="20"/>
+            </w:pPr>
+            <w:r>
+              <w:rPr>
+                <w:sz w:val="16"/>
+              </w:rPr>
+              <w:t xml:space="preserve">TreatmentReason</w:t>
+            </w:r>
+          </w:p>
+        </w:tc>
+        <w:tc>
+          <w:tcPr>
+            <w:tcW w:w="3408" w:type="dxa"/>
+            <w:tcMar>
+              <w:top w:w="80" w:type="dxa"/>
+              <w:left w:w="100" w:type="dxa"/>
+              <w:bottom w:w="80" w:type="dxa"/>
+              <w:right w:w="100" w:type="dxa"/>
+            </w:tcMar>
+            <w:vAlign w:val="center"/>
+          </w:tcPr>
+          <w:p>
+            <w:pPr>
+              <w:spacing w:after="20"/>
+              <w:rPr>
+                <w:lang w:val="pt-BR"/>
+              </w:rPr>
+            </w:pPr>
+            <w:r>
+              <w:rPr>
+                <w:sz w:val="16"/>
+                <w:lang w:val="pt-BR"/>
+              </w:rPr>
+              <w:t xml:space="preserve">Motivo do tratamento declarado pelo titular, reaproveitado por vários planos.</w:t>
             </w:r>
           </w:p>
         </w:tc>
@@ -36069,6 +36258,19 @@
           <w:lang w:val="pt-BR"/>
         </w:rPr>
         <w:t xml:space="preserve">Revisão da OpenAPI para 02.33.9 em 27/10/2026 (DEC-037), aprovada pelo mantenedor: periodicidade do plano com todos os dias, dias da semana escolhidos ou a cada N dias contados do início.</w:t>
+      </w:r>
+    </w:p>
+    <w:p>
+      <w:pPr>
+        <w:rPr>
+          <w:lang w:val="pt-BR"/>
+        </w:rPr>
+      </w:pPr>
+      <w:r>
+        <w:rPr>
+          <w:lang w:val="pt-BR"/>
+        </w:rPr>
+        <w:t xml:space="preserve">Revisão da OpenAPI para 02.33.10 em 28/10/2026 (DEC-038), aprovada pelo mantenedor: motivo do tratamento opcional no plano, reaproveitado por vários remédios, com a nova operação listTreatmentReasons e o motivo no histórico e no PDF.</w:t>
       </w:r>
     </w:p>
     <w:p>

</xml_diff>